<commit_message>
At NOC changes post dy214 - reverse single profile oxy calibration, uway not fully checked
</commit_message>
<xml_diff>
--- a/docs/CTD_processing_log.docx
+++ b/docs/CTD_processing_log.docx
@@ -21,14 +21,14 @@
         <w:gridCol w:w="522"/>
         <w:gridCol w:w="3903"/>
         <w:gridCol w:w="3376"/>
-        <w:gridCol w:w="1700"/>
-        <w:gridCol w:w="850"/>
-        <w:gridCol w:w="851"/>
+        <w:gridCol w:w="1701"/>
         <w:gridCol w:w="850"/>
         <w:gridCol w:w="850"/>
+        <w:gridCol w:w="853"/>
+        <w:gridCol w:w="848"/>
+        <w:gridCol w:w="852"/>
         <w:gridCol w:w="850"/>
-        <w:gridCol w:w="850"/>
-        <w:gridCol w:w="848"/>
+        <w:gridCol w:w="845"/>
       </w:tblGrid>
       <w:tr>
         <w:trPr>
@@ -92,7 +92,6 @@
                 <w:lang w:val="en-GB" w:eastAsia="en-US" w:bidi="ar-SA"/>
               </w:rPr>
               <w:t>CE26008</w:t>
-              <w:tab/>
             </w:r>
           </w:p>
         </w:tc>
@@ -140,28 +139,29 @@
         </w:tc>
         <w:tc>
           <w:tcPr>
-            <w:tcW w:w="1700" w:type="dxa"/>
-            <w:tcBorders/>
-          </w:tcPr>
-          <w:p>
-            <w:pPr>
-              <w:pStyle w:val="Normal"/>
-              <w:widowControl/>
-              <w:suppressAutoHyphens w:val="true"/>
-              <w:spacing w:before="0" w:after="0"/>
-              <w:jc w:val="left"/>
-              <w:rPr>
-                <w:rFonts w:ascii="Arial" w:hAnsi="Arial" w:cs="Arial"/>
-                <w:sz w:val="22"/>
-                <w:szCs w:val="22"/>
-              </w:rPr>
-            </w:pPr>
-            <w:r>
-              <w:rPr>
-                <w:rFonts w:cs="Arial" w:ascii="Arial" w:hAnsi="Arial"/>
-                <w:sz w:val="22"/>
-                <w:szCs w:val="22"/>
-              </w:rPr>
+            <w:tcW w:w="1701" w:type="dxa"/>
+            <w:tcBorders/>
+          </w:tcPr>
+          <w:p>
+            <w:pPr>
+              <w:pStyle w:val="Normal"/>
+              <w:widowControl/>
+              <w:suppressAutoHyphens w:val="true"/>
+              <w:spacing w:before="0" w:after="0"/>
+              <w:jc w:val="left"/>
+              <w:rPr>
+                <w:rFonts w:ascii="Arial" w:hAnsi="Arial" w:cs="Arial"/>
+                <w:sz w:val="22"/>
+                <w:szCs w:val="22"/>
+              </w:rPr>
+            </w:pPr>
+            <w:r>
+              <w:rPr>
+                <w:rFonts w:cs="Arial" w:ascii="Arial" w:hAnsi="Arial"/>
+                <w:sz w:val="22"/>
+                <w:szCs w:val="22"/>
+              </w:rPr>
+              <w:t>1</w:t>
             </w:r>
           </w:p>
         </w:tc>
@@ -194,33 +194,6 @@
         </w:tc>
         <w:tc>
           <w:tcPr>
-            <w:tcW w:w="851" w:type="dxa"/>
-            <w:tcBorders/>
-          </w:tcPr>
-          <w:p>
-            <w:pPr>
-              <w:pStyle w:val="Normal"/>
-              <w:widowControl/>
-              <w:suppressAutoHyphens w:val="true"/>
-              <w:spacing w:before="0" w:after="0"/>
-              <w:jc w:val="left"/>
-              <w:rPr>
-                <w:rFonts w:ascii="Arial" w:hAnsi="Arial" w:cs="Arial"/>
-                <w:sz w:val="22"/>
-                <w:szCs w:val="22"/>
-              </w:rPr>
-            </w:pPr>
-            <w:r>
-              <w:rPr>
-                <w:rFonts w:cs="Arial" w:ascii="Arial" w:hAnsi="Arial"/>
-                <w:sz w:val="22"/>
-                <w:szCs w:val="22"/>
-              </w:rPr>
-            </w:r>
-          </w:p>
-        </w:tc>
-        <w:tc>
-          <w:tcPr>
             <w:tcW w:w="850" w:type="dxa"/>
             <w:tcBorders/>
           </w:tcPr>
@@ -248,6 +221,87 @@
         </w:tc>
         <w:tc>
           <w:tcPr>
+            <w:tcW w:w="853" w:type="dxa"/>
+            <w:tcBorders/>
+          </w:tcPr>
+          <w:p>
+            <w:pPr>
+              <w:pStyle w:val="Normal"/>
+              <w:widowControl/>
+              <w:suppressAutoHyphens w:val="true"/>
+              <w:spacing w:before="0" w:after="0"/>
+              <w:jc w:val="left"/>
+              <w:rPr>
+                <w:rFonts w:ascii="Arial" w:hAnsi="Arial" w:cs="Arial"/>
+                <w:sz w:val="22"/>
+                <w:szCs w:val="22"/>
+              </w:rPr>
+            </w:pPr>
+            <w:r>
+              <w:rPr>
+                <w:rFonts w:cs="Arial" w:ascii="Arial" w:hAnsi="Arial"/>
+                <w:sz w:val="22"/>
+                <w:szCs w:val="22"/>
+              </w:rPr>
+            </w:r>
+          </w:p>
+        </w:tc>
+        <w:tc>
+          <w:tcPr>
+            <w:tcW w:w="848" w:type="dxa"/>
+            <w:tcBorders/>
+          </w:tcPr>
+          <w:p>
+            <w:pPr>
+              <w:pStyle w:val="Normal"/>
+              <w:widowControl/>
+              <w:suppressAutoHyphens w:val="true"/>
+              <w:spacing w:before="0" w:after="0"/>
+              <w:jc w:val="left"/>
+              <w:rPr>
+                <w:rFonts w:ascii="Arial" w:hAnsi="Arial" w:cs="Arial"/>
+                <w:sz w:val="22"/>
+                <w:szCs w:val="22"/>
+              </w:rPr>
+            </w:pPr>
+            <w:r>
+              <w:rPr>
+                <w:rFonts w:cs="Arial" w:ascii="Arial" w:hAnsi="Arial"/>
+                <w:sz w:val="22"/>
+                <w:szCs w:val="22"/>
+              </w:rPr>
+            </w:r>
+          </w:p>
+        </w:tc>
+        <w:tc>
+          <w:tcPr>
+            <w:tcW w:w="852" w:type="dxa"/>
+            <w:tcBorders/>
+          </w:tcPr>
+          <w:p>
+            <w:pPr>
+              <w:pStyle w:val="Normal"/>
+              <w:widowControl/>
+              <w:suppressAutoHyphens w:val="true"/>
+              <w:spacing w:before="0" w:after="0"/>
+              <w:jc w:val="left"/>
+              <w:rPr>
+                <w:rFonts w:ascii="Arial" w:hAnsi="Arial" w:cs="Arial"/>
+                <w:sz w:val="22"/>
+                <w:szCs w:val="22"/>
+              </w:rPr>
+            </w:pPr>
+            <w:r>
+              <w:rPr>
+                <w:rFonts w:cs="Arial" w:ascii="Arial" w:hAnsi="Arial"/>
+                <w:sz w:val="22"/>
+                <w:szCs w:val="22"/>
+              </w:rPr>
+            </w:r>
+          </w:p>
+        </w:tc>
+        <w:tc>
+          <w:tcPr>
             <w:tcW w:w="850" w:type="dxa"/>
             <w:tcBorders/>
           </w:tcPr>
@@ -275,61 +329,7 @@
         </w:tc>
         <w:tc>
           <w:tcPr>
-            <w:tcW w:w="850" w:type="dxa"/>
-            <w:tcBorders/>
-          </w:tcPr>
-          <w:p>
-            <w:pPr>
-              <w:pStyle w:val="Normal"/>
-              <w:widowControl/>
-              <w:suppressAutoHyphens w:val="true"/>
-              <w:spacing w:before="0" w:after="0"/>
-              <w:jc w:val="left"/>
-              <w:rPr>
-                <w:rFonts w:ascii="Arial" w:hAnsi="Arial" w:cs="Arial"/>
-                <w:sz w:val="22"/>
-                <w:szCs w:val="22"/>
-              </w:rPr>
-            </w:pPr>
-            <w:r>
-              <w:rPr>
-                <w:rFonts w:cs="Arial" w:ascii="Arial" w:hAnsi="Arial"/>
-                <w:sz w:val="22"/>
-                <w:szCs w:val="22"/>
-              </w:rPr>
-            </w:r>
-          </w:p>
-        </w:tc>
-        <w:tc>
-          <w:tcPr>
-            <w:tcW w:w="850" w:type="dxa"/>
-            <w:tcBorders/>
-          </w:tcPr>
-          <w:p>
-            <w:pPr>
-              <w:pStyle w:val="Normal"/>
-              <w:widowControl/>
-              <w:suppressAutoHyphens w:val="true"/>
-              <w:spacing w:before="0" w:after="0"/>
-              <w:jc w:val="left"/>
-              <w:rPr>
-                <w:rFonts w:ascii="Arial" w:hAnsi="Arial" w:cs="Arial"/>
-                <w:sz w:val="22"/>
-                <w:szCs w:val="22"/>
-              </w:rPr>
-            </w:pPr>
-            <w:r>
-              <w:rPr>
-                <w:rFonts w:cs="Arial" w:ascii="Arial" w:hAnsi="Arial"/>
-                <w:sz w:val="22"/>
-                <w:szCs w:val="22"/>
-              </w:rPr>
-            </w:r>
-          </w:p>
-        </w:tc>
-        <w:tc>
-          <w:tcPr>
-            <w:tcW w:w="848" w:type="dxa"/>
+            <w:tcW w:w="845" w:type="dxa"/>
             <w:tcBorders/>
           </w:tcPr>
           <w:p>
@@ -446,7 +446,7 @@
         </w:tc>
         <w:tc>
           <w:tcPr>
-            <w:tcW w:w="1700" w:type="dxa"/>
+            <w:tcW w:w="1701" w:type="dxa"/>
             <w:tcBorders/>
           </w:tcPr>
           <w:p>
@@ -500,33 +500,6 @@
         </w:tc>
         <w:tc>
           <w:tcPr>
-            <w:tcW w:w="851" w:type="dxa"/>
-            <w:tcBorders/>
-          </w:tcPr>
-          <w:p>
-            <w:pPr>
-              <w:pStyle w:val="Normal"/>
-              <w:widowControl/>
-              <w:suppressAutoHyphens w:val="true"/>
-              <w:spacing w:before="0" w:after="0"/>
-              <w:jc w:val="left"/>
-              <w:rPr>
-                <w:rFonts w:ascii="Arial" w:hAnsi="Arial" w:cs="Arial"/>
-                <w:sz w:val="22"/>
-                <w:szCs w:val="22"/>
-              </w:rPr>
-            </w:pPr>
-            <w:r>
-              <w:rPr>
-                <w:rFonts w:cs="Arial" w:ascii="Arial" w:hAnsi="Arial"/>
-                <w:sz w:val="22"/>
-                <w:szCs w:val="22"/>
-              </w:rPr>
-            </w:r>
-          </w:p>
-        </w:tc>
-        <w:tc>
-          <w:tcPr>
             <w:tcW w:w="850" w:type="dxa"/>
             <w:tcBorders/>
           </w:tcPr>
@@ -554,6 +527,87 @@
         </w:tc>
         <w:tc>
           <w:tcPr>
+            <w:tcW w:w="853" w:type="dxa"/>
+            <w:tcBorders/>
+          </w:tcPr>
+          <w:p>
+            <w:pPr>
+              <w:pStyle w:val="Normal"/>
+              <w:widowControl/>
+              <w:suppressAutoHyphens w:val="true"/>
+              <w:spacing w:before="0" w:after="0"/>
+              <w:jc w:val="left"/>
+              <w:rPr>
+                <w:rFonts w:ascii="Arial" w:hAnsi="Arial" w:cs="Arial"/>
+                <w:sz w:val="22"/>
+                <w:szCs w:val="22"/>
+              </w:rPr>
+            </w:pPr>
+            <w:r>
+              <w:rPr>
+                <w:rFonts w:cs="Arial" w:ascii="Arial" w:hAnsi="Arial"/>
+                <w:sz w:val="22"/>
+                <w:szCs w:val="22"/>
+              </w:rPr>
+            </w:r>
+          </w:p>
+        </w:tc>
+        <w:tc>
+          <w:tcPr>
+            <w:tcW w:w="848" w:type="dxa"/>
+            <w:tcBorders/>
+          </w:tcPr>
+          <w:p>
+            <w:pPr>
+              <w:pStyle w:val="Normal"/>
+              <w:widowControl/>
+              <w:suppressAutoHyphens w:val="true"/>
+              <w:spacing w:before="0" w:after="0"/>
+              <w:jc w:val="left"/>
+              <w:rPr>
+                <w:rFonts w:ascii="Arial" w:hAnsi="Arial" w:cs="Arial"/>
+                <w:sz w:val="22"/>
+                <w:szCs w:val="22"/>
+              </w:rPr>
+            </w:pPr>
+            <w:r>
+              <w:rPr>
+                <w:rFonts w:cs="Arial" w:ascii="Arial" w:hAnsi="Arial"/>
+                <w:sz w:val="22"/>
+                <w:szCs w:val="22"/>
+              </w:rPr>
+            </w:r>
+          </w:p>
+        </w:tc>
+        <w:tc>
+          <w:tcPr>
+            <w:tcW w:w="852" w:type="dxa"/>
+            <w:tcBorders/>
+          </w:tcPr>
+          <w:p>
+            <w:pPr>
+              <w:pStyle w:val="Normal"/>
+              <w:widowControl/>
+              <w:suppressAutoHyphens w:val="true"/>
+              <w:spacing w:before="0" w:after="0"/>
+              <w:jc w:val="left"/>
+              <w:rPr>
+                <w:rFonts w:ascii="Arial" w:hAnsi="Arial" w:cs="Arial"/>
+                <w:sz w:val="22"/>
+                <w:szCs w:val="22"/>
+              </w:rPr>
+            </w:pPr>
+            <w:r>
+              <w:rPr>
+                <w:rFonts w:cs="Arial" w:ascii="Arial" w:hAnsi="Arial"/>
+                <w:sz w:val="22"/>
+                <w:szCs w:val="22"/>
+              </w:rPr>
+            </w:r>
+          </w:p>
+        </w:tc>
+        <w:tc>
+          <w:tcPr>
             <w:tcW w:w="850" w:type="dxa"/>
             <w:tcBorders/>
           </w:tcPr>
@@ -581,61 +635,7 @@
         </w:tc>
         <w:tc>
           <w:tcPr>
-            <w:tcW w:w="850" w:type="dxa"/>
-            <w:tcBorders/>
-          </w:tcPr>
-          <w:p>
-            <w:pPr>
-              <w:pStyle w:val="Normal"/>
-              <w:widowControl/>
-              <w:suppressAutoHyphens w:val="true"/>
-              <w:spacing w:before="0" w:after="0"/>
-              <w:jc w:val="left"/>
-              <w:rPr>
-                <w:rFonts w:ascii="Arial" w:hAnsi="Arial" w:cs="Arial"/>
-                <w:sz w:val="22"/>
-                <w:szCs w:val="22"/>
-              </w:rPr>
-            </w:pPr>
-            <w:r>
-              <w:rPr>
-                <w:rFonts w:cs="Arial" w:ascii="Arial" w:hAnsi="Arial"/>
-                <w:sz w:val="22"/>
-                <w:szCs w:val="22"/>
-              </w:rPr>
-            </w:r>
-          </w:p>
-        </w:tc>
-        <w:tc>
-          <w:tcPr>
-            <w:tcW w:w="850" w:type="dxa"/>
-            <w:tcBorders/>
-          </w:tcPr>
-          <w:p>
-            <w:pPr>
-              <w:pStyle w:val="Normal"/>
-              <w:widowControl/>
-              <w:suppressAutoHyphens w:val="true"/>
-              <w:spacing w:before="0" w:after="0"/>
-              <w:jc w:val="left"/>
-              <w:rPr>
-                <w:rFonts w:ascii="Arial" w:hAnsi="Arial" w:cs="Arial"/>
-                <w:sz w:val="22"/>
-                <w:szCs w:val="22"/>
-              </w:rPr>
-            </w:pPr>
-            <w:r>
-              <w:rPr>
-                <w:rFonts w:cs="Arial" w:ascii="Arial" w:hAnsi="Arial"/>
-                <w:sz w:val="22"/>
-                <w:szCs w:val="22"/>
-              </w:rPr>
-            </w:r>
-          </w:p>
-        </w:tc>
-        <w:tc>
-          <w:tcPr>
-            <w:tcW w:w="848" w:type="dxa"/>
+            <w:tcW w:w="845" w:type="dxa"/>
             <w:tcBorders/>
           </w:tcPr>
           <w:p>
@@ -662,7 +662,9 @@
         </w:tc>
       </w:tr>
       <w:tr>
-        <w:trPr/>
+        <w:trPr>
+          <w:trHeight w:val="684" w:hRule="atLeast"/>
+        </w:trPr>
         <w:tc>
           <w:tcPr>
             <w:tcW w:w="522" w:type="dxa"/>
@@ -755,6 +757,27 @@
             <w:tcBorders/>
             <w:shd w:color="auto" w:fill="F2F2F2" w:themeFill="background1" w:themeFillShade="f2" w:val="clear"/>
           </w:tcPr>
+          <w:p>
+            <w:pPr>
+              <w:pStyle w:val="Normal"/>
+              <w:widowControl/>
+              <w:suppressAutoHyphens w:val="true"/>
+              <w:spacing w:before="0" w:after="0"/>
+              <w:jc w:val="left"/>
+              <w:rPr>
+                <w:rFonts w:ascii="Times New Roman" w:hAnsi="Times New Roman" w:cs="Times New Roman"/>
+                <w:sz w:val="22"/>
+                <w:szCs w:val="22"/>
+              </w:rPr>
+            </w:pPr>
+            <w:r>
+              <w:rPr>
+                <w:rFonts w:cs="Times New Roman" w:ascii="Times New Roman" w:hAnsi="Times New Roman"/>
+                <w:sz w:val="22"/>
+                <w:szCs w:val="22"/>
+              </w:rPr>
+            </w:r>
+          </w:p>
           <w:p>
             <w:pPr>
               <w:pStyle w:val="Normal"/>
@@ -778,7 +801,7 @@
                 <w:szCs w:val="22"/>
                 <w:lang w:val="en-GB" w:eastAsia="en-US" w:bidi="ar-SA"/>
               </w:rPr>
-              <w:t>C26008_nnn</w:t>
+              <w:t>dy214_nnn</w:t>
             </w:r>
             <w:r>
               <w:rPr>
@@ -794,7 +817,7 @@
         </w:tc>
         <w:tc>
           <w:tcPr>
-            <w:tcW w:w="1700" w:type="dxa"/>
+            <w:tcW w:w="1701" w:type="dxa"/>
             <w:tcBorders/>
             <w:shd w:color="auto" w:fill="F2F2F2" w:themeFill="background1" w:themeFillShade="f2" w:val="clear"/>
           </w:tcPr>
@@ -850,7 +873,7 @@
         </w:tc>
         <w:tc>
           <w:tcPr>
-            <w:tcW w:w="851" w:type="dxa"/>
+            <w:tcW w:w="850" w:type="dxa"/>
             <w:tcBorders/>
             <w:shd w:color="auto" w:fill="F2F2F2" w:themeFill="background1" w:themeFillShade="f2" w:val="clear"/>
           </w:tcPr>
@@ -878,6 +901,90 @@
         </w:tc>
         <w:tc>
           <w:tcPr>
+            <w:tcW w:w="853" w:type="dxa"/>
+            <w:tcBorders/>
+            <w:shd w:color="auto" w:fill="F2F2F2" w:themeFill="background1" w:themeFillShade="f2" w:val="clear"/>
+          </w:tcPr>
+          <w:p>
+            <w:pPr>
+              <w:pStyle w:val="Normal"/>
+              <w:widowControl/>
+              <w:suppressAutoHyphens w:val="true"/>
+              <w:spacing w:before="0" w:after="0"/>
+              <w:jc w:val="left"/>
+              <w:rPr>
+                <w:rFonts w:ascii="Arial" w:hAnsi="Arial" w:cs="Arial"/>
+                <w:sz w:val="22"/>
+                <w:szCs w:val="22"/>
+              </w:rPr>
+            </w:pPr>
+            <w:r>
+              <w:rPr>
+                <w:rFonts w:cs="Arial" w:ascii="Arial" w:hAnsi="Arial"/>
+                <w:sz w:val="22"/>
+                <w:szCs w:val="22"/>
+              </w:rPr>
+            </w:r>
+          </w:p>
+        </w:tc>
+        <w:tc>
+          <w:tcPr>
+            <w:tcW w:w="848" w:type="dxa"/>
+            <w:tcBorders/>
+            <w:shd w:color="auto" w:fill="F2F2F2" w:themeFill="background1" w:themeFillShade="f2" w:val="clear"/>
+          </w:tcPr>
+          <w:p>
+            <w:pPr>
+              <w:pStyle w:val="Normal"/>
+              <w:widowControl/>
+              <w:suppressAutoHyphens w:val="true"/>
+              <w:spacing w:before="0" w:after="0"/>
+              <w:jc w:val="left"/>
+              <w:rPr>
+                <w:rFonts w:ascii="Arial" w:hAnsi="Arial" w:cs="Arial"/>
+                <w:sz w:val="22"/>
+                <w:szCs w:val="22"/>
+              </w:rPr>
+            </w:pPr>
+            <w:r>
+              <w:rPr>
+                <w:rFonts w:cs="Arial" w:ascii="Arial" w:hAnsi="Arial"/>
+                <w:sz w:val="22"/>
+                <w:szCs w:val="22"/>
+              </w:rPr>
+            </w:r>
+          </w:p>
+        </w:tc>
+        <w:tc>
+          <w:tcPr>
+            <w:tcW w:w="852" w:type="dxa"/>
+            <w:tcBorders/>
+            <w:shd w:color="auto" w:fill="F2F2F2" w:themeFill="background1" w:themeFillShade="f2" w:val="clear"/>
+          </w:tcPr>
+          <w:p>
+            <w:pPr>
+              <w:pStyle w:val="Normal"/>
+              <w:widowControl/>
+              <w:suppressAutoHyphens w:val="true"/>
+              <w:spacing w:before="0" w:after="0"/>
+              <w:jc w:val="left"/>
+              <w:rPr>
+                <w:rFonts w:ascii="Arial" w:hAnsi="Arial" w:cs="Arial"/>
+                <w:sz w:val="22"/>
+                <w:szCs w:val="22"/>
+              </w:rPr>
+            </w:pPr>
+            <w:r>
+              <w:rPr>
+                <w:rFonts w:cs="Arial" w:ascii="Arial" w:hAnsi="Arial"/>
+                <w:sz w:val="22"/>
+                <w:szCs w:val="22"/>
+              </w:rPr>
+            </w:r>
+          </w:p>
+        </w:tc>
+        <w:tc>
+          <w:tcPr>
             <w:tcW w:w="850" w:type="dxa"/>
             <w:tcBorders/>
             <w:shd w:color="auto" w:fill="F2F2F2" w:themeFill="background1" w:themeFillShade="f2" w:val="clear"/>
@@ -906,91 +1013,7 @@
         </w:tc>
         <w:tc>
           <w:tcPr>
-            <w:tcW w:w="850" w:type="dxa"/>
-            <w:tcBorders/>
-            <w:shd w:color="auto" w:fill="F2F2F2" w:themeFill="background1" w:themeFillShade="f2" w:val="clear"/>
-          </w:tcPr>
-          <w:p>
-            <w:pPr>
-              <w:pStyle w:val="Normal"/>
-              <w:widowControl/>
-              <w:suppressAutoHyphens w:val="true"/>
-              <w:spacing w:before="0" w:after="0"/>
-              <w:jc w:val="left"/>
-              <w:rPr>
-                <w:rFonts w:ascii="Arial" w:hAnsi="Arial" w:cs="Arial"/>
-                <w:sz w:val="22"/>
-                <w:szCs w:val="22"/>
-              </w:rPr>
-            </w:pPr>
-            <w:r>
-              <w:rPr>
-                <w:rFonts w:cs="Arial" w:ascii="Arial" w:hAnsi="Arial"/>
-                <w:sz w:val="22"/>
-                <w:szCs w:val="22"/>
-              </w:rPr>
-            </w:r>
-          </w:p>
-        </w:tc>
-        <w:tc>
-          <w:tcPr>
-            <w:tcW w:w="850" w:type="dxa"/>
-            <w:tcBorders/>
-            <w:shd w:color="auto" w:fill="F2F2F2" w:themeFill="background1" w:themeFillShade="f2" w:val="clear"/>
-          </w:tcPr>
-          <w:p>
-            <w:pPr>
-              <w:pStyle w:val="Normal"/>
-              <w:widowControl/>
-              <w:suppressAutoHyphens w:val="true"/>
-              <w:spacing w:before="0" w:after="0"/>
-              <w:jc w:val="left"/>
-              <w:rPr>
-                <w:rFonts w:ascii="Arial" w:hAnsi="Arial" w:cs="Arial"/>
-                <w:sz w:val="22"/>
-                <w:szCs w:val="22"/>
-              </w:rPr>
-            </w:pPr>
-            <w:r>
-              <w:rPr>
-                <w:rFonts w:cs="Arial" w:ascii="Arial" w:hAnsi="Arial"/>
-                <w:sz w:val="22"/>
-                <w:szCs w:val="22"/>
-              </w:rPr>
-            </w:r>
-          </w:p>
-        </w:tc>
-        <w:tc>
-          <w:tcPr>
-            <w:tcW w:w="850" w:type="dxa"/>
-            <w:tcBorders/>
-            <w:shd w:color="auto" w:fill="F2F2F2" w:themeFill="background1" w:themeFillShade="f2" w:val="clear"/>
-          </w:tcPr>
-          <w:p>
-            <w:pPr>
-              <w:pStyle w:val="Normal"/>
-              <w:widowControl/>
-              <w:suppressAutoHyphens w:val="true"/>
-              <w:spacing w:before="0" w:after="0"/>
-              <w:jc w:val="left"/>
-              <w:rPr>
-                <w:rFonts w:ascii="Arial" w:hAnsi="Arial" w:cs="Arial"/>
-                <w:sz w:val="22"/>
-                <w:szCs w:val="22"/>
-              </w:rPr>
-            </w:pPr>
-            <w:r>
-              <w:rPr>
-                <w:rFonts w:cs="Arial" w:ascii="Arial" w:hAnsi="Arial"/>
-                <w:sz w:val="22"/>
-                <w:szCs w:val="22"/>
-              </w:rPr>
-            </w:r>
-          </w:p>
-        </w:tc>
-        <w:tc>
-          <w:tcPr>
-            <w:tcW w:w="848" w:type="dxa"/>
+            <w:tcW w:w="845" w:type="dxa"/>
             <w:tcBorders/>
             <w:shd w:color="auto" w:fill="F2F2F2" w:themeFill="background1" w:themeFillShade="f2" w:val="clear"/>
           </w:tcPr>
@@ -1287,7 +1310,7 @@
                 <w:szCs w:val="22"/>
                 <w:lang w:val="en-GB" w:eastAsia="en-US" w:bidi="ar-SA"/>
               </w:rPr>
-              <w:t xml:space="preserve">*nnn_cnv.nc, *nnn_cleaned.nc, *nnn_24hz.nc, *nnn_1hz.nc, dcs*_nnn.nc, </w:t>
+              <w:t>*nnn_cnv.nc, *nnn_cleaned.nc, *nnn_24hz.nc, *nnn_1hz.nc, dcs*_nnn.nc,</w:t>
             </w:r>
           </w:p>
           <w:p>
@@ -1353,7 +1376,7 @@
         </w:tc>
         <w:tc>
           <w:tcPr>
-            <w:tcW w:w="1700" w:type="dxa"/>
+            <w:tcW w:w="1701" w:type="dxa"/>
             <w:tcBorders/>
           </w:tcPr>
           <w:p>
@@ -1407,33 +1430,6 @@
         </w:tc>
         <w:tc>
           <w:tcPr>
-            <w:tcW w:w="851" w:type="dxa"/>
-            <w:tcBorders/>
-          </w:tcPr>
-          <w:p>
-            <w:pPr>
-              <w:pStyle w:val="Normal"/>
-              <w:widowControl/>
-              <w:suppressAutoHyphens w:val="true"/>
-              <w:spacing w:before="0" w:after="0"/>
-              <w:jc w:val="left"/>
-              <w:rPr>
-                <w:rFonts w:ascii="Arial" w:hAnsi="Arial" w:cs="Arial"/>
-                <w:sz w:val="22"/>
-                <w:szCs w:val="22"/>
-              </w:rPr>
-            </w:pPr>
-            <w:r>
-              <w:rPr>
-                <w:rFonts w:cs="Arial" w:ascii="Arial" w:hAnsi="Arial"/>
-                <w:sz w:val="22"/>
-                <w:szCs w:val="22"/>
-              </w:rPr>
-            </w:r>
-          </w:p>
-        </w:tc>
-        <w:tc>
-          <w:tcPr>
             <w:tcW w:w="850" w:type="dxa"/>
             <w:tcBorders/>
           </w:tcPr>
@@ -1461,6 +1457,87 @@
         </w:tc>
         <w:tc>
           <w:tcPr>
+            <w:tcW w:w="853" w:type="dxa"/>
+            <w:tcBorders/>
+          </w:tcPr>
+          <w:p>
+            <w:pPr>
+              <w:pStyle w:val="Normal"/>
+              <w:widowControl/>
+              <w:suppressAutoHyphens w:val="true"/>
+              <w:spacing w:before="0" w:after="0"/>
+              <w:jc w:val="left"/>
+              <w:rPr>
+                <w:rFonts w:ascii="Arial" w:hAnsi="Arial" w:cs="Arial"/>
+                <w:sz w:val="22"/>
+                <w:szCs w:val="22"/>
+              </w:rPr>
+            </w:pPr>
+            <w:r>
+              <w:rPr>
+                <w:rFonts w:cs="Arial" w:ascii="Arial" w:hAnsi="Arial"/>
+                <w:sz w:val="22"/>
+                <w:szCs w:val="22"/>
+              </w:rPr>
+            </w:r>
+          </w:p>
+        </w:tc>
+        <w:tc>
+          <w:tcPr>
+            <w:tcW w:w="848" w:type="dxa"/>
+            <w:tcBorders/>
+          </w:tcPr>
+          <w:p>
+            <w:pPr>
+              <w:pStyle w:val="Normal"/>
+              <w:widowControl/>
+              <w:suppressAutoHyphens w:val="true"/>
+              <w:spacing w:before="0" w:after="0"/>
+              <w:jc w:val="left"/>
+              <w:rPr>
+                <w:rFonts w:ascii="Arial" w:hAnsi="Arial" w:cs="Arial"/>
+                <w:sz w:val="22"/>
+                <w:szCs w:val="22"/>
+              </w:rPr>
+            </w:pPr>
+            <w:r>
+              <w:rPr>
+                <w:rFonts w:cs="Arial" w:ascii="Arial" w:hAnsi="Arial"/>
+                <w:sz w:val="22"/>
+                <w:szCs w:val="22"/>
+              </w:rPr>
+            </w:r>
+          </w:p>
+        </w:tc>
+        <w:tc>
+          <w:tcPr>
+            <w:tcW w:w="852" w:type="dxa"/>
+            <w:tcBorders/>
+          </w:tcPr>
+          <w:p>
+            <w:pPr>
+              <w:pStyle w:val="Normal"/>
+              <w:widowControl/>
+              <w:suppressAutoHyphens w:val="true"/>
+              <w:spacing w:before="0" w:after="0"/>
+              <w:jc w:val="left"/>
+              <w:rPr>
+                <w:rFonts w:ascii="Arial" w:hAnsi="Arial" w:cs="Arial"/>
+                <w:sz w:val="22"/>
+                <w:szCs w:val="22"/>
+              </w:rPr>
+            </w:pPr>
+            <w:r>
+              <w:rPr>
+                <w:rFonts w:cs="Arial" w:ascii="Arial" w:hAnsi="Arial"/>
+                <w:sz w:val="22"/>
+                <w:szCs w:val="22"/>
+              </w:rPr>
+            </w:r>
+          </w:p>
+        </w:tc>
+        <w:tc>
+          <w:tcPr>
             <w:tcW w:w="850" w:type="dxa"/>
             <w:tcBorders/>
           </w:tcPr>
@@ -1488,61 +1565,7 @@
         </w:tc>
         <w:tc>
           <w:tcPr>
-            <w:tcW w:w="850" w:type="dxa"/>
-            <w:tcBorders/>
-          </w:tcPr>
-          <w:p>
-            <w:pPr>
-              <w:pStyle w:val="Normal"/>
-              <w:widowControl/>
-              <w:suppressAutoHyphens w:val="true"/>
-              <w:spacing w:before="0" w:after="0"/>
-              <w:jc w:val="left"/>
-              <w:rPr>
-                <w:rFonts w:ascii="Arial" w:hAnsi="Arial" w:cs="Arial"/>
-                <w:sz w:val="22"/>
-                <w:szCs w:val="22"/>
-              </w:rPr>
-            </w:pPr>
-            <w:r>
-              <w:rPr>
-                <w:rFonts w:cs="Arial" w:ascii="Arial" w:hAnsi="Arial"/>
-                <w:sz w:val="22"/>
-                <w:szCs w:val="22"/>
-              </w:rPr>
-            </w:r>
-          </w:p>
-        </w:tc>
-        <w:tc>
-          <w:tcPr>
-            <w:tcW w:w="850" w:type="dxa"/>
-            <w:tcBorders/>
-          </w:tcPr>
-          <w:p>
-            <w:pPr>
-              <w:pStyle w:val="Normal"/>
-              <w:widowControl/>
-              <w:suppressAutoHyphens w:val="true"/>
-              <w:spacing w:before="0" w:after="0"/>
-              <w:jc w:val="left"/>
-              <w:rPr>
-                <w:rFonts w:ascii="Arial" w:hAnsi="Arial" w:cs="Arial"/>
-                <w:sz w:val="22"/>
-                <w:szCs w:val="22"/>
-              </w:rPr>
-            </w:pPr>
-            <w:r>
-              <w:rPr>
-                <w:rFonts w:cs="Arial" w:ascii="Arial" w:hAnsi="Arial"/>
-                <w:sz w:val="22"/>
-                <w:szCs w:val="22"/>
-              </w:rPr>
-            </w:r>
-          </w:p>
-        </w:tc>
-        <w:tc>
-          <w:tcPr>
-            <w:tcW w:w="848" w:type="dxa"/>
+            <w:tcW w:w="845" w:type="dxa"/>
             <w:tcBorders/>
           </w:tcPr>
           <w:p>
@@ -1662,7 +1685,7 @@
         </w:tc>
         <w:tc>
           <w:tcPr>
-            <w:tcW w:w="1700" w:type="dxa"/>
+            <w:tcW w:w="1701" w:type="dxa"/>
             <w:tcBorders/>
           </w:tcPr>
           <w:p>
@@ -1716,33 +1739,6 @@
         </w:tc>
         <w:tc>
           <w:tcPr>
-            <w:tcW w:w="851" w:type="dxa"/>
-            <w:tcBorders/>
-          </w:tcPr>
-          <w:p>
-            <w:pPr>
-              <w:pStyle w:val="Normal"/>
-              <w:widowControl/>
-              <w:suppressAutoHyphens w:val="true"/>
-              <w:spacing w:before="0" w:after="0"/>
-              <w:jc w:val="left"/>
-              <w:rPr>
-                <w:rFonts w:ascii="Arial" w:hAnsi="Arial" w:cs="Arial"/>
-                <w:sz w:val="22"/>
-                <w:szCs w:val="22"/>
-              </w:rPr>
-            </w:pPr>
-            <w:r>
-              <w:rPr>
-                <w:rFonts w:cs="Arial" w:ascii="Arial" w:hAnsi="Arial"/>
-                <w:sz w:val="22"/>
-                <w:szCs w:val="22"/>
-              </w:rPr>
-            </w:r>
-          </w:p>
-        </w:tc>
-        <w:tc>
-          <w:tcPr>
             <w:tcW w:w="850" w:type="dxa"/>
             <w:tcBorders/>
           </w:tcPr>
@@ -1770,6 +1766,87 @@
         </w:tc>
         <w:tc>
           <w:tcPr>
+            <w:tcW w:w="853" w:type="dxa"/>
+            <w:tcBorders/>
+          </w:tcPr>
+          <w:p>
+            <w:pPr>
+              <w:pStyle w:val="Normal"/>
+              <w:widowControl/>
+              <w:suppressAutoHyphens w:val="true"/>
+              <w:spacing w:before="0" w:after="0"/>
+              <w:jc w:val="left"/>
+              <w:rPr>
+                <w:rFonts w:ascii="Arial" w:hAnsi="Arial" w:cs="Arial"/>
+                <w:sz w:val="22"/>
+                <w:szCs w:val="22"/>
+              </w:rPr>
+            </w:pPr>
+            <w:r>
+              <w:rPr>
+                <w:rFonts w:cs="Arial" w:ascii="Arial" w:hAnsi="Arial"/>
+                <w:sz w:val="22"/>
+                <w:szCs w:val="22"/>
+              </w:rPr>
+            </w:r>
+          </w:p>
+        </w:tc>
+        <w:tc>
+          <w:tcPr>
+            <w:tcW w:w="848" w:type="dxa"/>
+            <w:tcBorders/>
+          </w:tcPr>
+          <w:p>
+            <w:pPr>
+              <w:pStyle w:val="Normal"/>
+              <w:widowControl/>
+              <w:suppressAutoHyphens w:val="true"/>
+              <w:spacing w:before="0" w:after="0"/>
+              <w:jc w:val="left"/>
+              <w:rPr>
+                <w:rFonts w:ascii="Arial" w:hAnsi="Arial" w:cs="Arial"/>
+                <w:sz w:val="22"/>
+                <w:szCs w:val="22"/>
+              </w:rPr>
+            </w:pPr>
+            <w:r>
+              <w:rPr>
+                <w:rFonts w:cs="Arial" w:ascii="Arial" w:hAnsi="Arial"/>
+                <w:sz w:val="22"/>
+                <w:szCs w:val="22"/>
+              </w:rPr>
+            </w:r>
+          </w:p>
+        </w:tc>
+        <w:tc>
+          <w:tcPr>
+            <w:tcW w:w="852" w:type="dxa"/>
+            <w:tcBorders/>
+          </w:tcPr>
+          <w:p>
+            <w:pPr>
+              <w:pStyle w:val="Normal"/>
+              <w:widowControl/>
+              <w:suppressAutoHyphens w:val="true"/>
+              <w:spacing w:before="0" w:after="0"/>
+              <w:jc w:val="left"/>
+              <w:rPr>
+                <w:rFonts w:ascii="Arial" w:hAnsi="Arial" w:cs="Arial"/>
+                <w:sz w:val="22"/>
+                <w:szCs w:val="22"/>
+              </w:rPr>
+            </w:pPr>
+            <w:r>
+              <w:rPr>
+                <w:rFonts w:cs="Arial" w:ascii="Arial" w:hAnsi="Arial"/>
+                <w:sz w:val="22"/>
+                <w:szCs w:val="22"/>
+              </w:rPr>
+            </w:r>
+          </w:p>
+        </w:tc>
+        <w:tc>
+          <w:tcPr>
             <w:tcW w:w="850" w:type="dxa"/>
             <w:tcBorders/>
           </w:tcPr>
@@ -1797,61 +1874,7 @@
         </w:tc>
         <w:tc>
           <w:tcPr>
-            <w:tcW w:w="850" w:type="dxa"/>
-            <w:tcBorders/>
-          </w:tcPr>
-          <w:p>
-            <w:pPr>
-              <w:pStyle w:val="Normal"/>
-              <w:widowControl/>
-              <w:suppressAutoHyphens w:val="true"/>
-              <w:spacing w:before="0" w:after="0"/>
-              <w:jc w:val="left"/>
-              <w:rPr>
-                <w:rFonts w:ascii="Arial" w:hAnsi="Arial" w:cs="Arial"/>
-                <w:sz w:val="22"/>
-                <w:szCs w:val="22"/>
-              </w:rPr>
-            </w:pPr>
-            <w:r>
-              <w:rPr>
-                <w:rFonts w:cs="Arial" w:ascii="Arial" w:hAnsi="Arial"/>
-                <w:sz w:val="22"/>
-                <w:szCs w:val="22"/>
-              </w:rPr>
-            </w:r>
-          </w:p>
-        </w:tc>
-        <w:tc>
-          <w:tcPr>
-            <w:tcW w:w="850" w:type="dxa"/>
-            <w:tcBorders/>
-          </w:tcPr>
-          <w:p>
-            <w:pPr>
-              <w:pStyle w:val="Normal"/>
-              <w:widowControl/>
-              <w:suppressAutoHyphens w:val="true"/>
-              <w:spacing w:before="0" w:after="0"/>
-              <w:jc w:val="left"/>
-              <w:rPr>
-                <w:rFonts w:ascii="Arial" w:hAnsi="Arial" w:cs="Arial"/>
-                <w:sz w:val="22"/>
-                <w:szCs w:val="22"/>
-              </w:rPr>
-            </w:pPr>
-            <w:r>
-              <w:rPr>
-                <w:rFonts w:cs="Arial" w:ascii="Arial" w:hAnsi="Arial"/>
-                <w:sz w:val="22"/>
-                <w:szCs w:val="22"/>
-              </w:rPr>
-            </w:r>
-          </w:p>
-        </w:tc>
-        <w:tc>
-          <w:tcPr>
-            <w:tcW w:w="848" w:type="dxa"/>
+            <w:tcW w:w="845" w:type="dxa"/>
             <w:tcBorders/>
           </w:tcPr>
           <w:p>
@@ -1965,7 +1988,7 @@
                 <w:szCs w:val="20"/>
                 <w:lang w:val="en-GB" w:eastAsia="en-US" w:bidi="ar-SA"/>
               </w:rPr>
-              <w:t xml:space="preserve">a) If Niskins leaking or misfired, add flags </w:t>
+              <w:t>a) If Niskins leaking or misfired, add flags</w:t>
             </w:r>
           </w:p>
           <w:p>
@@ -1995,7 +2018,7 @@
         </w:tc>
         <w:tc>
           <w:tcPr>
-            <w:tcW w:w="1700" w:type="dxa"/>
+            <w:tcW w:w="1701" w:type="dxa"/>
             <w:tcBorders/>
           </w:tcPr>
           <w:p>
@@ -2049,33 +2072,6 @@
         </w:tc>
         <w:tc>
           <w:tcPr>
-            <w:tcW w:w="851" w:type="dxa"/>
-            <w:tcBorders/>
-          </w:tcPr>
-          <w:p>
-            <w:pPr>
-              <w:pStyle w:val="Normal"/>
-              <w:widowControl/>
-              <w:suppressAutoHyphens w:val="true"/>
-              <w:spacing w:before="0" w:after="0"/>
-              <w:jc w:val="left"/>
-              <w:rPr>
-                <w:rFonts w:ascii="Arial" w:hAnsi="Arial" w:cs="Arial"/>
-                <w:sz w:val="22"/>
-                <w:szCs w:val="22"/>
-              </w:rPr>
-            </w:pPr>
-            <w:r>
-              <w:rPr>
-                <w:rFonts w:cs="Arial" w:ascii="Arial" w:hAnsi="Arial"/>
-                <w:sz w:val="22"/>
-                <w:szCs w:val="22"/>
-              </w:rPr>
-            </w:r>
-          </w:p>
-        </w:tc>
-        <w:tc>
-          <w:tcPr>
             <w:tcW w:w="850" w:type="dxa"/>
             <w:tcBorders/>
           </w:tcPr>
@@ -2103,6 +2099,87 @@
         </w:tc>
         <w:tc>
           <w:tcPr>
+            <w:tcW w:w="853" w:type="dxa"/>
+            <w:tcBorders/>
+          </w:tcPr>
+          <w:p>
+            <w:pPr>
+              <w:pStyle w:val="Normal"/>
+              <w:widowControl/>
+              <w:suppressAutoHyphens w:val="true"/>
+              <w:spacing w:before="0" w:after="0"/>
+              <w:jc w:val="left"/>
+              <w:rPr>
+                <w:rFonts w:ascii="Arial" w:hAnsi="Arial" w:cs="Arial"/>
+                <w:sz w:val="22"/>
+                <w:szCs w:val="22"/>
+              </w:rPr>
+            </w:pPr>
+            <w:r>
+              <w:rPr>
+                <w:rFonts w:cs="Arial" w:ascii="Arial" w:hAnsi="Arial"/>
+                <w:sz w:val="22"/>
+                <w:szCs w:val="22"/>
+              </w:rPr>
+            </w:r>
+          </w:p>
+        </w:tc>
+        <w:tc>
+          <w:tcPr>
+            <w:tcW w:w="848" w:type="dxa"/>
+            <w:tcBorders/>
+          </w:tcPr>
+          <w:p>
+            <w:pPr>
+              <w:pStyle w:val="Normal"/>
+              <w:widowControl/>
+              <w:suppressAutoHyphens w:val="true"/>
+              <w:spacing w:before="0" w:after="0"/>
+              <w:jc w:val="left"/>
+              <w:rPr>
+                <w:rFonts w:ascii="Arial" w:hAnsi="Arial" w:cs="Arial"/>
+                <w:sz w:val="22"/>
+                <w:szCs w:val="22"/>
+              </w:rPr>
+            </w:pPr>
+            <w:r>
+              <w:rPr>
+                <w:rFonts w:cs="Arial" w:ascii="Arial" w:hAnsi="Arial"/>
+                <w:sz w:val="22"/>
+                <w:szCs w:val="22"/>
+              </w:rPr>
+            </w:r>
+          </w:p>
+        </w:tc>
+        <w:tc>
+          <w:tcPr>
+            <w:tcW w:w="852" w:type="dxa"/>
+            <w:tcBorders/>
+          </w:tcPr>
+          <w:p>
+            <w:pPr>
+              <w:pStyle w:val="Normal"/>
+              <w:widowControl/>
+              <w:suppressAutoHyphens w:val="true"/>
+              <w:spacing w:before="0" w:after="0"/>
+              <w:jc w:val="left"/>
+              <w:rPr>
+                <w:rFonts w:ascii="Arial" w:hAnsi="Arial" w:cs="Arial"/>
+                <w:sz w:val="22"/>
+                <w:szCs w:val="22"/>
+              </w:rPr>
+            </w:pPr>
+            <w:r>
+              <w:rPr>
+                <w:rFonts w:cs="Arial" w:ascii="Arial" w:hAnsi="Arial"/>
+                <w:sz w:val="22"/>
+                <w:szCs w:val="22"/>
+              </w:rPr>
+            </w:r>
+          </w:p>
+        </w:tc>
+        <w:tc>
+          <w:tcPr>
             <w:tcW w:w="850" w:type="dxa"/>
             <w:tcBorders/>
           </w:tcPr>
@@ -2130,61 +2207,7 @@
         </w:tc>
         <w:tc>
           <w:tcPr>
-            <w:tcW w:w="850" w:type="dxa"/>
-            <w:tcBorders/>
-          </w:tcPr>
-          <w:p>
-            <w:pPr>
-              <w:pStyle w:val="Normal"/>
-              <w:widowControl/>
-              <w:suppressAutoHyphens w:val="true"/>
-              <w:spacing w:before="0" w:after="0"/>
-              <w:jc w:val="left"/>
-              <w:rPr>
-                <w:rFonts w:ascii="Arial" w:hAnsi="Arial" w:cs="Arial"/>
-                <w:sz w:val="22"/>
-                <w:szCs w:val="22"/>
-              </w:rPr>
-            </w:pPr>
-            <w:r>
-              <w:rPr>
-                <w:rFonts w:cs="Arial" w:ascii="Arial" w:hAnsi="Arial"/>
-                <w:sz w:val="22"/>
-                <w:szCs w:val="22"/>
-              </w:rPr>
-            </w:r>
-          </w:p>
-        </w:tc>
-        <w:tc>
-          <w:tcPr>
-            <w:tcW w:w="850" w:type="dxa"/>
-            <w:tcBorders/>
-          </w:tcPr>
-          <w:p>
-            <w:pPr>
-              <w:pStyle w:val="Normal"/>
-              <w:widowControl/>
-              <w:suppressAutoHyphens w:val="true"/>
-              <w:spacing w:before="0" w:after="0"/>
-              <w:jc w:val="left"/>
-              <w:rPr>
-                <w:rFonts w:ascii="Arial" w:hAnsi="Arial" w:cs="Arial"/>
-                <w:sz w:val="22"/>
-                <w:szCs w:val="22"/>
-              </w:rPr>
-            </w:pPr>
-            <w:r>
-              <w:rPr>
-                <w:rFonts w:cs="Arial" w:ascii="Arial" w:hAnsi="Arial"/>
-                <w:sz w:val="22"/>
-                <w:szCs w:val="22"/>
-              </w:rPr>
-            </w:r>
-          </w:p>
-        </w:tc>
-        <w:tc>
-          <w:tcPr>
-            <w:tcW w:w="848" w:type="dxa"/>
+            <w:tcW w:w="845" w:type="dxa"/>
             <w:tcBorders/>
           </w:tcPr>
           <w:p>
@@ -2612,7 +2635,7 @@
         </w:tc>
         <w:tc>
           <w:tcPr>
-            <w:tcW w:w="1700" w:type="dxa"/>
+            <w:tcW w:w="1701" w:type="dxa"/>
             <w:tcBorders/>
           </w:tcPr>
           <w:p>
@@ -2666,33 +2689,6 @@
         </w:tc>
         <w:tc>
           <w:tcPr>
-            <w:tcW w:w="851" w:type="dxa"/>
-            <w:tcBorders/>
-          </w:tcPr>
-          <w:p>
-            <w:pPr>
-              <w:pStyle w:val="Normal"/>
-              <w:widowControl/>
-              <w:suppressAutoHyphens w:val="true"/>
-              <w:spacing w:before="0" w:after="0"/>
-              <w:jc w:val="left"/>
-              <w:rPr>
-                <w:rFonts w:ascii="Arial" w:hAnsi="Arial" w:cs="Arial"/>
-                <w:sz w:val="22"/>
-                <w:szCs w:val="22"/>
-              </w:rPr>
-            </w:pPr>
-            <w:r>
-              <w:rPr>
-                <w:rFonts w:cs="Arial" w:ascii="Arial" w:hAnsi="Arial"/>
-                <w:sz w:val="22"/>
-                <w:szCs w:val="22"/>
-              </w:rPr>
-            </w:r>
-          </w:p>
-        </w:tc>
-        <w:tc>
-          <w:tcPr>
             <w:tcW w:w="850" w:type="dxa"/>
             <w:tcBorders/>
           </w:tcPr>
@@ -2720,6 +2716,87 @@
         </w:tc>
         <w:tc>
           <w:tcPr>
+            <w:tcW w:w="853" w:type="dxa"/>
+            <w:tcBorders/>
+          </w:tcPr>
+          <w:p>
+            <w:pPr>
+              <w:pStyle w:val="Normal"/>
+              <w:widowControl/>
+              <w:suppressAutoHyphens w:val="true"/>
+              <w:spacing w:before="0" w:after="0"/>
+              <w:jc w:val="left"/>
+              <w:rPr>
+                <w:rFonts w:ascii="Arial" w:hAnsi="Arial" w:cs="Arial"/>
+                <w:sz w:val="22"/>
+                <w:szCs w:val="22"/>
+              </w:rPr>
+            </w:pPr>
+            <w:r>
+              <w:rPr>
+                <w:rFonts w:cs="Arial" w:ascii="Arial" w:hAnsi="Arial"/>
+                <w:sz w:val="22"/>
+                <w:szCs w:val="22"/>
+              </w:rPr>
+            </w:r>
+          </w:p>
+        </w:tc>
+        <w:tc>
+          <w:tcPr>
+            <w:tcW w:w="848" w:type="dxa"/>
+            <w:tcBorders/>
+          </w:tcPr>
+          <w:p>
+            <w:pPr>
+              <w:pStyle w:val="Normal"/>
+              <w:widowControl/>
+              <w:suppressAutoHyphens w:val="true"/>
+              <w:spacing w:before="0" w:after="0"/>
+              <w:jc w:val="left"/>
+              <w:rPr>
+                <w:rFonts w:ascii="Arial" w:hAnsi="Arial" w:cs="Arial"/>
+                <w:sz w:val="22"/>
+                <w:szCs w:val="22"/>
+              </w:rPr>
+            </w:pPr>
+            <w:r>
+              <w:rPr>
+                <w:rFonts w:cs="Arial" w:ascii="Arial" w:hAnsi="Arial"/>
+                <w:sz w:val="22"/>
+                <w:szCs w:val="22"/>
+              </w:rPr>
+            </w:r>
+          </w:p>
+        </w:tc>
+        <w:tc>
+          <w:tcPr>
+            <w:tcW w:w="852" w:type="dxa"/>
+            <w:tcBorders/>
+          </w:tcPr>
+          <w:p>
+            <w:pPr>
+              <w:pStyle w:val="Normal"/>
+              <w:widowControl/>
+              <w:suppressAutoHyphens w:val="true"/>
+              <w:spacing w:before="0" w:after="0"/>
+              <w:jc w:val="left"/>
+              <w:rPr>
+                <w:rFonts w:ascii="Arial" w:hAnsi="Arial" w:cs="Arial"/>
+                <w:sz w:val="22"/>
+                <w:szCs w:val="22"/>
+              </w:rPr>
+            </w:pPr>
+            <w:r>
+              <w:rPr>
+                <w:rFonts w:cs="Arial" w:ascii="Arial" w:hAnsi="Arial"/>
+                <w:sz w:val="22"/>
+                <w:szCs w:val="22"/>
+              </w:rPr>
+            </w:r>
+          </w:p>
+        </w:tc>
+        <w:tc>
+          <w:tcPr>
             <w:tcW w:w="850" w:type="dxa"/>
             <w:tcBorders/>
           </w:tcPr>
@@ -2747,61 +2824,7 @@
         </w:tc>
         <w:tc>
           <w:tcPr>
-            <w:tcW w:w="850" w:type="dxa"/>
-            <w:tcBorders/>
-          </w:tcPr>
-          <w:p>
-            <w:pPr>
-              <w:pStyle w:val="Normal"/>
-              <w:widowControl/>
-              <w:suppressAutoHyphens w:val="true"/>
-              <w:spacing w:before="0" w:after="0"/>
-              <w:jc w:val="left"/>
-              <w:rPr>
-                <w:rFonts w:ascii="Arial" w:hAnsi="Arial" w:cs="Arial"/>
-                <w:sz w:val="22"/>
-                <w:szCs w:val="22"/>
-              </w:rPr>
-            </w:pPr>
-            <w:r>
-              <w:rPr>
-                <w:rFonts w:cs="Arial" w:ascii="Arial" w:hAnsi="Arial"/>
-                <w:sz w:val="22"/>
-                <w:szCs w:val="22"/>
-              </w:rPr>
-            </w:r>
-          </w:p>
-        </w:tc>
-        <w:tc>
-          <w:tcPr>
-            <w:tcW w:w="850" w:type="dxa"/>
-            <w:tcBorders/>
-          </w:tcPr>
-          <w:p>
-            <w:pPr>
-              <w:pStyle w:val="Normal"/>
-              <w:widowControl/>
-              <w:suppressAutoHyphens w:val="true"/>
-              <w:spacing w:before="0" w:after="0"/>
-              <w:jc w:val="left"/>
-              <w:rPr>
-                <w:rFonts w:ascii="Arial" w:hAnsi="Arial" w:cs="Arial"/>
-                <w:sz w:val="22"/>
-                <w:szCs w:val="22"/>
-              </w:rPr>
-            </w:pPr>
-            <w:r>
-              <w:rPr>
-                <w:rFonts w:cs="Arial" w:ascii="Arial" w:hAnsi="Arial"/>
-                <w:sz w:val="22"/>
-                <w:szCs w:val="22"/>
-              </w:rPr>
-            </w:r>
-          </w:p>
-        </w:tc>
-        <w:tc>
-          <w:tcPr>
-            <w:tcW w:w="848" w:type="dxa"/>
+            <w:tcW w:w="845" w:type="dxa"/>
             <w:tcBorders/>
           </w:tcPr>
           <w:p>
@@ -2966,7 +2989,7 @@
         </w:tc>
         <w:tc>
           <w:tcPr>
-            <w:tcW w:w="1700" w:type="dxa"/>
+            <w:tcW w:w="1701" w:type="dxa"/>
             <w:tcBorders/>
           </w:tcPr>
           <w:p>
@@ -3020,33 +3043,6 @@
         </w:tc>
         <w:tc>
           <w:tcPr>
-            <w:tcW w:w="851" w:type="dxa"/>
-            <w:tcBorders/>
-          </w:tcPr>
-          <w:p>
-            <w:pPr>
-              <w:pStyle w:val="Normal"/>
-              <w:widowControl/>
-              <w:suppressAutoHyphens w:val="true"/>
-              <w:spacing w:before="0" w:after="0"/>
-              <w:jc w:val="left"/>
-              <w:rPr>
-                <w:rFonts w:ascii="Arial" w:hAnsi="Arial" w:cs="Arial"/>
-                <w:sz w:val="22"/>
-                <w:szCs w:val="22"/>
-              </w:rPr>
-            </w:pPr>
-            <w:r>
-              <w:rPr>
-                <w:rFonts w:cs="Arial" w:ascii="Arial" w:hAnsi="Arial"/>
-                <w:sz w:val="22"/>
-                <w:szCs w:val="22"/>
-              </w:rPr>
-            </w:r>
-          </w:p>
-        </w:tc>
-        <w:tc>
-          <w:tcPr>
             <w:tcW w:w="850" w:type="dxa"/>
             <w:tcBorders/>
           </w:tcPr>
@@ -3074,6 +3070,87 @@
         </w:tc>
         <w:tc>
           <w:tcPr>
+            <w:tcW w:w="853" w:type="dxa"/>
+            <w:tcBorders/>
+          </w:tcPr>
+          <w:p>
+            <w:pPr>
+              <w:pStyle w:val="Normal"/>
+              <w:widowControl/>
+              <w:suppressAutoHyphens w:val="true"/>
+              <w:spacing w:before="0" w:after="0"/>
+              <w:jc w:val="left"/>
+              <w:rPr>
+                <w:rFonts w:ascii="Arial" w:hAnsi="Arial" w:cs="Arial"/>
+                <w:sz w:val="22"/>
+                <w:szCs w:val="22"/>
+              </w:rPr>
+            </w:pPr>
+            <w:r>
+              <w:rPr>
+                <w:rFonts w:cs="Arial" w:ascii="Arial" w:hAnsi="Arial"/>
+                <w:sz w:val="22"/>
+                <w:szCs w:val="22"/>
+              </w:rPr>
+            </w:r>
+          </w:p>
+        </w:tc>
+        <w:tc>
+          <w:tcPr>
+            <w:tcW w:w="848" w:type="dxa"/>
+            <w:tcBorders/>
+          </w:tcPr>
+          <w:p>
+            <w:pPr>
+              <w:pStyle w:val="Normal"/>
+              <w:widowControl/>
+              <w:suppressAutoHyphens w:val="true"/>
+              <w:spacing w:before="0" w:after="0"/>
+              <w:jc w:val="left"/>
+              <w:rPr>
+                <w:rFonts w:ascii="Arial" w:hAnsi="Arial" w:cs="Arial"/>
+                <w:sz w:val="22"/>
+                <w:szCs w:val="22"/>
+              </w:rPr>
+            </w:pPr>
+            <w:r>
+              <w:rPr>
+                <w:rFonts w:cs="Arial" w:ascii="Arial" w:hAnsi="Arial"/>
+                <w:sz w:val="22"/>
+                <w:szCs w:val="22"/>
+              </w:rPr>
+            </w:r>
+          </w:p>
+        </w:tc>
+        <w:tc>
+          <w:tcPr>
+            <w:tcW w:w="852" w:type="dxa"/>
+            <w:tcBorders/>
+          </w:tcPr>
+          <w:p>
+            <w:pPr>
+              <w:pStyle w:val="Normal"/>
+              <w:widowControl/>
+              <w:suppressAutoHyphens w:val="true"/>
+              <w:spacing w:before="0" w:after="0"/>
+              <w:jc w:val="left"/>
+              <w:rPr>
+                <w:rFonts w:ascii="Arial" w:hAnsi="Arial" w:cs="Arial"/>
+                <w:sz w:val="22"/>
+                <w:szCs w:val="22"/>
+              </w:rPr>
+            </w:pPr>
+            <w:r>
+              <w:rPr>
+                <w:rFonts w:cs="Arial" w:ascii="Arial" w:hAnsi="Arial"/>
+                <w:sz w:val="22"/>
+                <w:szCs w:val="22"/>
+              </w:rPr>
+            </w:r>
+          </w:p>
+        </w:tc>
+        <w:tc>
+          <w:tcPr>
             <w:tcW w:w="850" w:type="dxa"/>
             <w:tcBorders/>
           </w:tcPr>
@@ -3101,61 +3178,7 @@
         </w:tc>
         <w:tc>
           <w:tcPr>
-            <w:tcW w:w="850" w:type="dxa"/>
-            <w:tcBorders/>
-          </w:tcPr>
-          <w:p>
-            <w:pPr>
-              <w:pStyle w:val="Normal"/>
-              <w:widowControl/>
-              <w:suppressAutoHyphens w:val="true"/>
-              <w:spacing w:before="0" w:after="0"/>
-              <w:jc w:val="left"/>
-              <w:rPr>
-                <w:rFonts w:ascii="Arial" w:hAnsi="Arial" w:cs="Arial"/>
-                <w:sz w:val="22"/>
-                <w:szCs w:val="22"/>
-              </w:rPr>
-            </w:pPr>
-            <w:r>
-              <w:rPr>
-                <w:rFonts w:cs="Arial" w:ascii="Arial" w:hAnsi="Arial"/>
-                <w:sz w:val="22"/>
-                <w:szCs w:val="22"/>
-              </w:rPr>
-            </w:r>
-          </w:p>
-        </w:tc>
-        <w:tc>
-          <w:tcPr>
-            <w:tcW w:w="850" w:type="dxa"/>
-            <w:tcBorders/>
-          </w:tcPr>
-          <w:p>
-            <w:pPr>
-              <w:pStyle w:val="Normal"/>
-              <w:widowControl/>
-              <w:suppressAutoHyphens w:val="true"/>
-              <w:spacing w:before="0" w:after="0"/>
-              <w:jc w:val="left"/>
-              <w:rPr>
-                <w:rFonts w:ascii="Arial" w:hAnsi="Arial" w:cs="Arial"/>
-                <w:sz w:val="22"/>
-                <w:szCs w:val="22"/>
-              </w:rPr>
-            </w:pPr>
-            <w:r>
-              <w:rPr>
-                <w:rFonts w:cs="Arial" w:ascii="Arial" w:hAnsi="Arial"/>
-                <w:sz w:val="22"/>
-                <w:szCs w:val="22"/>
-              </w:rPr>
-            </w:r>
-          </w:p>
-        </w:tc>
-        <w:tc>
-          <w:tcPr>
-            <w:tcW w:w="848" w:type="dxa"/>
+            <w:tcW w:w="845" w:type="dxa"/>
             <w:tcBorders/>
           </w:tcPr>
           <w:p>
@@ -3368,7 +3391,7 @@
         </w:tc>
         <w:tc>
           <w:tcPr>
-            <w:tcW w:w="1700" w:type="dxa"/>
+            <w:tcW w:w="1701" w:type="dxa"/>
             <w:tcBorders/>
           </w:tcPr>
           <w:p>
@@ -3422,33 +3445,6 @@
         </w:tc>
         <w:tc>
           <w:tcPr>
-            <w:tcW w:w="851" w:type="dxa"/>
-            <w:tcBorders/>
-          </w:tcPr>
-          <w:p>
-            <w:pPr>
-              <w:pStyle w:val="Normal"/>
-              <w:widowControl/>
-              <w:suppressAutoHyphens w:val="true"/>
-              <w:spacing w:before="0" w:after="0"/>
-              <w:jc w:val="left"/>
-              <w:rPr>
-                <w:rFonts w:ascii="Arial" w:hAnsi="Arial" w:cs="Arial"/>
-                <w:sz w:val="22"/>
-                <w:szCs w:val="22"/>
-              </w:rPr>
-            </w:pPr>
-            <w:r>
-              <w:rPr>
-                <w:rFonts w:cs="Arial" w:ascii="Arial" w:hAnsi="Arial"/>
-                <w:sz w:val="22"/>
-                <w:szCs w:val="22"/>
-              </w:rPr>
-            </w:r>
-          </w:p>
-        </w:tc>
-        <w:tc>
-          <w:tcPr>
             <w:tcW w:w="850" w:type="dxa"/>
             <w:tcBorders/>
           </w:tcPr>
@@ -3476,6 +3472,87 @@
         </w:tc>
         <w:tc>
           <w:tcPr>
+            <w:tcW w:w="853" w:type="dxa"/>
+            <w:tcBorders/>
+          </w:tcPr>
+          <w:p>
+            <w:pPr>
+              <w:pStyle w:val="Normal"/>
+              <w:widowControl/>
+              <w:suppressAutoHyphens w:val="true"/>
+              <w:spacing w:before="0" w:after="0"/>
+              <w:jc w:val="left"/>
+              <w:rPr>
+                <w:rFonts w:ascii="Arial" w:hAnsi="Arial" w:cs="Arial"/>
+                <w:sz w:val="22"/>
+                <w:szCs w:val="22"/>
+              </w:rPr>
+            </w:pPr>
+            <w:r>
+              <w:rPr>
+                <w:rFonts w:cs="Arial" w:ascii="Arial" w:hAnsi="Arial"/>
+                <w:sz w:val="22"/>
+                <w:szCs w:val="22"/>
+              </w:rPr>
+            </w:r>
+          </w:p>
+        </w:tc>
+        <w:tc>
+          <w:tcPr>
+            <w:tcW w:w="848" w:type="dxa"/>
+            <w:tcBorders/>
+          </w:tcPr>
+          <w:p>
+            <w:pPr>
+              <w:pStyle w:val="Normal"/>
+              <w:widowControl/>
+              <w:suppressAutoHyphens w:val="true"/>
+              <w:spacing w:before="0" w:after="0"/>
+              <w:jc w:val="left"/>
+              <w:rPr>
+                <w:rFonts w:ascii="Arial" w:hAnsi="Arial" w:cs="Arial"/>
+                <w:sz w:val="22"/>
+                <w:szCs w:val="22"/>
+              </w:rPr>
+            </w:pPr>
+            <w:r>
+              <w:rPr>
+                <w:rFonts w:cs="Arial" w:ascii="Arial" w:hAnsi="Arial"/>
+                <w:sz w:val="22"/>
+                <w:szCs w:val="22"/>
+              </w:rPr>
+            </w:r>
+          </w:p>
+        </w:tc>
+        <w:tc>
+          <w:tcPr>
+            <w:tcW w:w="852" w:type="dxa"/>
+            <w:tcBorders/>
+          </w:tcPr>
+          <w:p>
+            <w:pPr>
+              <w:pStyle w:val="Normal"/>
+              <w:widowControl/>
+              <w:suppressAutoHyphens w:val="true"/>
+              <w:spacing w:before="0" w:after="0"/>
+              <w:jc w:val="left"/>
+              <w:rPr>
+                <w:rFonts w:ascii="Arial" w:hAnsi="Arial" w:cs="Arial"/>
+                <w:sz w:val="22"/>
+                <w:szCs w:val="22"/>
+              </w:rPr>
+            </w:pPr>
+            <w:r>
+              <w:rPr>
+                <w:rFonts w:cs="Arial" w:ascii="Arial" w:hAnsi="Arial"/>
+                <w:sz w:val="22"/>
+                <w:szCs w:val="22"/>
+              </w:rPr>
+            </w:r>
+          </w:p>
+        </w:tc>
+        <w:tc>
+          <w:tcPr>
             <w:tcW w:w="850" w:type="dxa"/>
             <w:tcBorders/>
           </w:tcPr>
@@ -3503,61 +3580,7 @@
         </w:tc>
         <w:tc>
           <w:tcPr>
-            <w:tcW w:w="850" w:type="dxa"/>
-            <w:tcBorders/>
-          </w:tcPr>
-          <w:p>
-            <w:pPr>
-              <w:pStyle w:val="Normal"/>
-              <w:widowControl/>
-              <w:suppressAutoHyphens w:val="true"/>
-              <w:spacing w:before="0" w:after="0"/>
-              <w:jc w:val="left"/>
-              <w:rPr>
-                <w:rFonts w:ascii="Arial" w:hAnsi="Arial" w:cs="Arial"/>
-                <w:sz w:val="22"/>
-                <w:szCs w:val="22"/>
-              </w:rPr>
-            </w:pPr>
-            <w:r>
-              <w:rPr>
-                <w:rFonts w:cs="Arial" w:ascii="Arial" w:hAnsi="Arial"/>
-                <w:sz w:val="22"/>
-                <w:szCs w:val="22"/>
-              </w:rPr>
-            </w:r>
-          </w:p>
-        </w:tc>
-        <w:tc>
-          <w:tcPr>
-            <w:tcW w:w="850" w:type="dxa"/>
-            <w:tcBorders/>
-          </w:tcPr>
-          <w:p>
-            <w:pPr>
-              <w:pStyle w:val="Normal"/>
-              <w:widowControl/>
-              <w:suppressAutoHyphens w:val="true"/>
-              <w:spacing w:before="0" w:after="0"/>
-              <w:jc w:val="left"/>
-              <w:rPr>
-                <w:rFonts w:ascii="Arial" w:hAnsi="Arial" w:cs="Arial"/>
-                <w:sz w:val="22"/>
-                <w:szCs w:val="22"/>
-              </w:rPr>
-            </w:pPr>
-            <w:r>
-              <w:rPr>
-                <w:rFonts w:cs="Arial" w:ascii="Arial" w:hAnsi="Arial"/>
-                <w:sz w:val="22"/>
-                <w:szCs w:val="22"/>
-              </w:rPr>
-            </w:r>
-          </w:p>
-        </w:tc>
-        <w:tc>
-          <w:tcPr>
-            <w:tcW w:w="848" w:type="dxa"/>
+            <w:tcW w:w="845" w:type="dxa"/>
             <w:tcBorders/>
           </w:tcPr>
           <w:p>
@@ -3704,7 +3727,7 @@
         </w:tc>
         <w:tc>
           <w:tcPr>
-            <w:tcW w:w="1700" w:type="dxa"/>
+            <w:tcW w:w="1701" w:type="dxa"/>
             <w:tcBorders/>
           </w:tcPr>
           <w:p>
@@ -3758,33 +3781,6 @@
         </w:tc>
         <w:tc>
           <w:tcPr>
-            <w:tcW w:w="851" w:type="dxa"/>
-            <w:tcBorders/>
-          </w:tcPr>
-          <w:p>
-            <w:pPr>
-              <w:pStyle w:val="Normal"/>
-              <w:widowControl/>
-              <w:suppressAutoHyphens w:val="true"/>
-              <w:spacing w:before="0" w:after="0"/>
-              <w:jc w:val="left"/>
-              <w:rPr>
-                <w:rFonts w:ascii="Arial" w:hAnsi="Arial" w:cs="Arial"/>
-                <w:sz w:val="22"/>
-                <w:szCs w:val="22"/>
-              </w:rPr>
-            </w:pPr>
-            <w:r>
-              <w:rPr>
-                <w:rFonts w:cs="Arial" w:ascii="Arial" w:hAnsi="Arial"/>
-                <w:sz w:val="22"/>
-                <w:szCs w:val="22"/>
-              </w:rPr>
-            </w:r>
-          </w:p>
-        </w:tc>
-        <w:tc>
-          <w:tcPr>
             <w:tcW w:w="850" w:type="dxa"/>
             <w:tcBorders/>
           </w:tcPr>
@@ -3812,6 +3808,87 @@
         </w:tc>
         <w:tc>
           <w:tcPr>
+            <w:tcW w:w="853" w:type="dxa"/>
+            <w:tcBorders/>
+          </w:tcPr>
+          <w:p>
+            <w:pPr>
+              <w:pStyle w:val="Normal"/>
+              <w:widowControl/>
+              <w:suppressAutoHyphens w:val="true"/>
+              <w:spacing w:before="0" w:after="0"/>
+              <w:jc w:val="left"/>
+              <w:rPr>
+                <w:rFonts w:ascii="Arial" w:hAnsi="Arial" w:cs="Arial"/>
+                <w:sz w:val="22"/>
+                <w:szCs w:val="22"/>
+              </w:rPr>
+            </w:pPr>
+            <w:r>
+              <w:rPr>
+                <w:rFonts w:cs="Arial" w:ascii="Arial" w:hAnsi="Arial"/>
+                <w:sz w:val="22"/>
+                <w:szCs w:val="22"/>
+              </w:rPr>
+            </w:r>
+          </w:p>
+        </w:tc>
+        <w:tc>
+          <w:tcPr>
+            <w:tcW w:w="848" w:type="dxa"/>
+            <w:tcBorders/>
+          </w:tcPr>
+          <w:p>
+            <w:pPr>
+              <w:pStyle w:val="Normal"/>
+              <w:widowControl/>
+              <w:suppressAutoHyphens w:val="true"/>
+              <w:spacing w:before="0" w:after="0"/>
+              <w:jc w:val="left"/>
+              <w:rPr>
+                <w:rFonts w:ascii="Arial" w:hAnsi="Arial" w:cs="Arial"/>
+                <w:sz w:val="22"/>
+                <w:szCs w:val="22"/>
+              </w:rPr>
+            </w:pPr>
+            <w:r>
+              <w:rPr>
+                <w:rFonts w:cs="Arial" w:ascii="Arial" w:hAnsi="Arial"/>
+                <w:sz w:val="22"/>
+                <w:szCs w:val="22"/>
+              </w:rPr>
+            </w:r>
+          </w:p>
+        </w:tc>
+        <w:tc>
+          <w:tcPr>
+            <w:tcW w:w="852" w:type="dxa"/>
+            <w:tcBorders/>
+          </w:tcPr>
+          <w:p>
+            <w:pPr>
+              <w:pStyle w:val="Normal"/>
+              <w:widowControl/>
+              <w:suppressAutoHyphens w:val="true"/>
+              <w:spacing w:before="0" w:after="0"/>
+              <w:jc w:val="left"/>
+              <w:rPr>
+                <w:rFonts w:ascii="Arial" w:hAnsi="Arial" w:cs="Arial"/>
+                <w:sz w:val="22"/>
+                <w:szCs w:val="22"/>
+              </w:rPr>
+            </w:pPr>
+            <w:r>
+              <w:rPr>
+                <w:rFonts w:cs="Arial" w:ascii="Arial" w:hAnsi="Arial"/>
+                <w:sz w:val="22"/>
+                <w:szCs w:val="22"/>
+              </w:rPr>
+            </w:r>
+          </w:p>
+        </w:tc>
+        <w:tc>
+          <w:tcPr>
             <w:tcW w:w="850" w:type="dxa"/>
             <w:tcBorders/>
           </w:tcPr>
@@ -3839,61 +3916,7 @@
         </w:tc>
         <w:tc>
           <w:tcPr>
-            <w:tcW w:w="850" w:type="dxa"/>
-            <w:tcBorders/>
-          </w:tcPr>
-          <w:p>
-            <w:pPr>
-              <w:pStyle w:val="Normal"/>
-              <w:widowControl/>
-              <w:suppressAutoHyphens w:val="true"/>
-              <w:spacing w:before="0" w:after="0"/>
-              <w:jc w:val="left"/>
-              <w:rPr>
-                <w:rFonts w:ascii="Arial" w:hAnsi="Arial" w:cs="Arial"/>
-                <w:sz w:val="22"/>
-                <w:szCs w:val="22"/>
-              </w:rPr>
-            </w:pPr>
-            <w:r>
-              <w:rPr>
-                <w:rFonts w:cs="Arial" w:ascii="Arial" w:hAnsi="Arial"/>
-                <w:sz w:val="22"/>
-                <w:szCs w:val="22"/>
-              </w:rPr>
-            </w:r>
-          </w:p>
-        </w:tc>
-        <w:tc>
-          <w:tcPr>
-            <w:tcW w:w="850" w:type="dxa"/>
-            <w:tcBorders/>
-          </w:tcPr>
-          <w:p>
-            <w:pPr>
-              <w:pStyle w:val="Normal"/>
-              <w:widowControl/>
-              <w:suppressAutoHyphens w:val="true"/>
-              <w:spacing w:before="0" w:after="0"/>
-              <w:jc w:val="left"/>
-              <w:rPr>
-                <w:rFonts w:ascii="Arial" w:hAnsi="Arial" w:cs="Arial"/>
-                <w:sz w:val="22"/>
-                <w:szCs w:val="22"/>
-              </w:rPr>
-            </w:pPr>
-            <w:r>
-              <w:rPr>
-                <w:rFonts w:cs="Arial" w:ascii="Arial" w:hAnsi="Arial"/>
-                <w:sz w:val="22"/>
-                <w:szCs w:val="22"/>
-              </w:rPr>
-            </w:r>
-          </w:p>
-        </w:tc>
-        <w:tc>
-          <w:tcPr>
-            <w:tcW w:w="848" w:type="dxa"/>
+            <w:tcW w:w="845" w:type="dxa"/>
             <w:tcBorders/>
           </w:tcPr>
           <w:p>
@@ -4206,7 +4229,7 @@
                 <w:szCs w:val="22"/>
                 <w:lang w:val="en-GB" w:eastAsia="en-US" w:bidi="ar-SA"/>
               </w:rPr>
-              <w:t>msal_01(‘psal’)</w:t>
+              <w:t>msal_01(‘sal’)</w:t>
             </w:r>
           </w:p>
           <w:p>
@@ -4226,8 +4249,11 @@
             </w:pPr>
             <w:r>
               <w:rPr>
-                <w:strike w:val="false"/>
-                <w:dstrike w:val="false"/>
+                <w:rFonts w:eastAsia="Calibri" w:cs="Arial" w:ascii="Arial" w:hAnsi="Arial"/>
+                <w:kern w:val="0"/>
+                <w:sz w:val="22"/>
+                <w:szCs w:val="22"/>
+                <w:lang w:val="en-GB" w:eastAsia="en-US" w:bidi="ar-SA"/>
               </w:rPr>
             </w:r>
           </w:p>
@@ -4253,7 +4279,7 @@
                 <w:szCs w:val="22"/>
                 <w:lang w:val="en-GB" w:eastAsia="en-US" w:bidi="ar-SA"/>
               </w:rPr>
-              <w:t>first in opt_dy214 under samp_proc, check set checksam.sal=1 and check outlieres</w:t>
+              <w:t>first in opt_dy214 under samp_proc, check set checksam.sal=1 and check outliers</w:t>
             </w:r>
           </w:p>
         </w:tc>
@@ -4376,6 +4402,29 @@
                 <w:sz w:val="22"/>
                 <w:szCs w:val="22"/>
               </w:rPr>
+              <w:t>21. September</w:t>
+            </w:r>
+          </w:p>
+          <w:p>
+            <w:pPr>
+              <w:pStyle w:val="Normal"/>
+              <w:widowControl/>
+              <w:suppressAutoHyphens w:val="true"/>
+              <w:spacing w:before="0" w:after="0"/>
+              <w:jc w:val="left"/>
+              <w:rPr>
+                <w:rFonts w:ascii="Arial" w:hAnsi="Arial" w:cs="Arial"/>
+                <w:sz w:val="22"/>
+                <w:szCs w:val="22"/>
+              </w:rPr>
+            </w:pPr>
+            <w:r>
+              <w:rPr>
+                <w:rFonts w:cs="Arial" w:ascii="Arial" w:hAnsi="Arial"/>
+                <w:sz w:val="22"/>
+                <w:szCs w:val="22"/>
+              </w:rPr>
+              <w:t>all samples</w:t>
             </w:r>
           </w:p>
         </w:tc>
@@ -4457,6 +4506,7 @@
                 <w:sz w:val="22"/>
                 <w:szCs w:val="22"/>
               </w:rPr>
+              <w:t>done</w:t>
             </w:r>
           </w:p>
         </w:tc>

</xml_diff>